<commit_message>
Corrige detalles del análisis dry lab
- Precisa por qué ningún rubro queda condicional
- Rotula como nota de prensa el tiempo por medición de muSORS
- Quita una página casi vacía en los anexos

Co-Authored-By: Claude Opus 5.5 <noreply@anthropic.com>
</commit_message>
<xml_diff>
--- a/docs/guia-del-proyecto.docx
+++ b/docs/guia-del-proyecto.docx
@@ -224,7 +224,7 @@
         <w:pStyle w:val="Ttulo1"/>
         <w:pageBreakBefore/>
       </w:pPr>
-      <w:bookmarkStart w:id="0" w:name="_Toc244186982"/>
+      <w:bookmarkStart w:id="0" w:name="_Toc244187225"/>
       <w:r>
         <w:t>Cómo leer este documento</w:t>
       </w:r>
@@ -390,7 +390,7 @@
           <w:szCs w:val="22"/>
         </w:rPr>
         <w:alias w:val="Índice"/>
-        <w:id w:val="-1789580660"/>
+        <w:id w:val="825787061"/>
         <w:docPartObj>
           <w:docPartGallery w:val="Table of Contents"/>
           <w:docPartUnique/>
@@ -425,7 +425,7 @@
           <w:r>
             <w:fldChar w:fldCharType="separate"/>
           </w:r>
-          <w:hyperlink w:anchor="_Toc244186982" w:history="1">
+          <w:hyperlink w:anchor="_Toc244187225" w:history="1">
             <w:r>
               <w:rPr>
                 <w:rStyle w:val="Hipervnculo"/>
@@ -449,7 +449,7 @@
               <w:rPr>
                 <w:noProof/>
               </w:rPr>
-              <w:instrText xml:space="preserve"> PAGEREF _Toc244186982 \h </w:instrText>
+              <w:instrText xml:space="preserve"> PAGEREF _Toc244187225 \h </w:instrText>
             </w:r>
             <w:r>
               <w:rPr>
@@ -494,7 +494,7 @@
               <w14:ligatures w14:val="standardContextual"/>
             </w:rPr>
           </w:pPr>
-          <w:hyperlink w:anchor="_Toc244186983" w:history="1">
+          <w:hyperlink w:anchor="_Toc244187226" w:history="1">
             <w:r>
               <w:rPr>
                 <w:rStyle w:val="Hipervnculo"/>
@@ -518,7 +518,7 @@
               <w:rPr>
                 <w:noProof/>
               </w:rPr>
-              <w:instrText xml:space="preserve"> PAGEREF _Toc244186983 \h </w:instrText>
+              <w:instrText xml:space="preserve"> PAGEREF _Toc244187226 \h </w:instrText>
             </w:r>
             <w:r>
               <w:rPr>
@@ -563,7 +563,7 @@
               <w14:ligatures w14:val="standardContextual"/>
             </w:rPr>
           </w:pPr>
-          <w:hyperlink w:anchor="_Toc244186984" w:history="1">
+          <w:hyperlink w:anchor="_Toc244187227" w:history="1">
             <w:r>
               <w:rPr>
                 <w:rStyle w:val="Hipervnculo"/>
@@ -587,7 +587,7 @@
               <w:rPr>
                 <w:noProof/>
               </w:rPr>
-              <w:instrText xml:space="preserve"> PAGEREF _Toc244186984 \h </w:instrText>
+              <w:instrText xml:space="preserve"> PAGEREF _Toc244187227 \h </w:instrText>
             </w:r>
             <w:r>
               <w:rPr>
@@ -630,7 +630,7 @@
               <w14:ligatures w14:val="standardContextual"/>
             </w:rPr>
           </w:pPr>
-          <w:hyperlink w:anchor="_Toc244186985" w:history="1">
+          <w:hyperlink w:anchor="_Toc244187228" w:history="1">
             <w:r>
               <w:rPr>
                 <w:rStyle w:val="Hipervnculo"/>
@@ -654,7 +654,7 @@
               <w:rPr>
                 <w:noProof/>
               </w:rPr>
-              <w:instrText xml:space="preserve"> PAGEREF _Toc244186985 \h </w:instrText>
+              <w:instrText xml:space="preserve"> PAGEREF _Toc244187228 \h </w:instrText>
             </w:r>
             <w:r>
               <w:rPr>
@@ -697,7 +697,7 @@
               <w14:ligatures w14:val="standardContextual"/>
             </w:rPr>
           </w:pPr>
-          <w:hyperlink w:anchor="_Toc244186986" w:history="1">
+          <w:hyperlink w:anchor="_Toc244187229" w:history="1">
             <w:r>
               <w:rPr>
                 <w:rStyle w:val="Hipervnculo"/>
@@ -721,7 +721,7 @@
               <w:rPr>
                 <w:noProof/>
               </w:rPr>
-              <w:instrText xml:space="preserve"> PAGEREF _Toc244186986 \h </w:instrText>
+              <w:instrText xml:space="preserve"> PAGEREF _Toc244187229 \h </w:instrText>
             </w:r>
             <w:r>
               <w:rPr>
@@ -764,7 +764,7 @@
               <w14:ligatures w14:val="standardContextual"/>
             </w:rPr>
           </w:pPr>
-          <w:hyperlink w:anchor="_Toc244186987" w:history="1">
+          <w:hyperlink w:anchor="_Toc244187230" w:history="1">
             <w:r>
               <w:rPr>
                 <w:rStyle w:val="Hipervnculo"/>
@@ -788,7 +788,7 @@
               <w:rPr>
                 <w:noProof/>
               </w:rPr>
-              <w:instrText xml:space="preserve"> PAGEREF _Toc244186987 \h </w:instrText>
+              <w:instrText xml:space="preserve"> PAGEREF _Toc244187230 \h </w:instrText>
             </w:r>
             <w:r>
               <w:rPr>
@@ -831,7 +831,7 @@
               <w14:ligatures w14:val="standardContextual"/>
             </w:rPr>
           </w:pPr>
-          <w:hyperlink w:anchor="_Toc244186988" w:history="1">
+          <w:hyperlink w:anchor="_Toc244187231" w:history="1">
             <w:r>
               <w:rPr>
                 <w:rStyle w:val="Hipervnculo"/>
@@ -855,7 +855,7 @@
               <w:rPr>
                 <w:noProof/>
               </w:rPr>
-              <w:instrText xml:space="preserve"> PAGEREF _Toc244186988 \h </w:instrText>
+              <w:instrText xml:space="preserve"> PAGEREF _Toc244187231 \h </w:instrText>
             </w:r>
             <w:r>
               <w:rPr>
@@ -900,7 +900,7 @@
               <w14:ligatures w14:val="standardContextual"/>
             </w:rPr>
           </w:pPr>
-          <w:hyperlink w:anchor="_Toc244186989" w:history="1">
+          <w:hyperlink w:anchor="_Toc244187232" w:history="1">
             <w:r>
               <w:rPr>
                 <w:rStyle w:val="Hipervnculo"/>
@@ -924,7 +924,7 @@
               <w:rPr>
                 <w:noProof/>
               </w:rPr>
-              <w:instrText xml:space="preserve"> PAGEREF _Toc244186989 \h </w:instrText>
+              <w:instrText xml:space="preserve"> PAGEREF _Toc244187232 \h </w:instrText>
             </w:r>
             <w:r>
               <w:rPr>
@@ -967,7 +967,7 @@
               <w14:ligatures w14:val="standardContextual"/>
             </w:rPr>
           </w:pPr>
-          <w:hyperlink w:anchor="_Toc244186990" w:history="1">
+          <w:hyperlink w:anchor="_Toc244187233" w:history="1">
             <w:r>
               <w:rPr>
                 <w:rStyle w:val="Hipervnculo"/>
@@ -991,7 +991,7 @@
               <w:rPr>
                 <w:noProof/>
               </w:rPr>
-              <w:instrText xml:space="preserve"> PAGEREF _Toc244186990 \h </w:instrText>
+              <w:instrText xml:space="preserve"> PAGEREF _Toc244187233 \h </w:instrText>
             </w:r>
             <w:r>
               <w:rPr>
@@ -1034,7 +1034,7 @@
               <w14:ligatures w14:val="standardContextual"/>
             </w:rPr>
           </w:pPr>
-          <w:hyperlink w:anchor="_Toc244186991" w:history="1">
+          <w:hyperlink w:anchor="_Toc244187234" w:history="1">
             <w:r>
               <w:rPr>
                 <w:rStyle w:val="Hipervnculo"/>
@@ -1058,7 +1058,7 @@
               <w:rPr>
                 <w:noProof/>
               </w:rPr>
-              <w:instrText xml:space="preserve"> PAGEREF _Toc244186991 \h </w:instrText>
+              <w:instrText xml:space="preserve"> PAGEREF _Toc244187234 \h </w:instrText>
             </w:r>
             <w:r>
               <w:rPr>
@@ -1101,7 +1101,7 @@
               <w14:ligatures w14:val="standardContextual"/>
             </w:rPr>
           </w:pPr>
-          <w:hyperlink w:anchor="_Toc244186992" w:history="1">
+          <w:hyperlink w:anchor="_Toc244187235" w:history="1">
             <w:r>
               <w:rPr>
                 <w:rStyle w:val="Hipervnculo"/>
@@ -1125,7 +1125,7 @@
               <w:rPr>
                 <w:noProof/>
               </w:rPr>
-              <w:instrText xml:space="preserve"> PAGEREF _Toc244186992 \h </w:instrText>
+              <w:instrText xml:space="preserve"> PAGEREF _Toc244187235 \h </w:instrText>
             </w:r>
             <w:r>
               <w:rPr>
@@ -1168,7 +1168,7 @@
               <w14:ligatures w14:val="standardContextual"/>
             </w:rPr>
           </w:pPr>
-          <w:hyperlink w:anchor="_Toc244186993" w:history="1">
+          <w:hyperlink w:anchor="_Toc244187236" w:history="1">
             <w:r>
               <w:rPr>
                 <w:rStyle w:val="Hipervnculo"/>
@@ -1192,7 +1192,7 @@
               <w:rPr>
                 <w:noProof/>
               </w:rPr>
-              <w:instrText xml:space="preserve"> PAGEREF _Toc244186993 \h </w:instrText>
+              <w:instrText xml:space="preserve"> PAGEREF _Toc244187236 \h </w:instrText>
             </w:r>
             <w:r>
               <w:rPr>
@@ -1235,7 +1235,7 @@
               <w14:ligatures w14:val="standardContextual"/>
             </w:rPr>
           </w:pPr>
-          <w:hyperlink w:anchor="_Toc244186994" w:history="1">
+          <w:hyperlink w:anchor="_Toc244187237" w:history="1">
             <w:r>
               <w:rPr>
                 <w:rStyle w:val="Hipervnculo"/>
@@ -1259,7 +1259,7 @@
               <w:rPr>
                 <w:noProof/>
               </w:rPr>
-              <w:instrText xml:space="preserve"> PAGEREF _Toc244186994 \h </w:instrText>
+              <w:instrText xml:space="preserve"> PAGEREF _Toc244187237 \h </w:instrText>
             </w:r>
             <w:r>
               <w:rPr>
@@ -1302,7 +1302,7 @@
               <w14:ligatures w14:val="standardContextual"/>
             </w:rPr>
           </w:pPr>
-          <w:hyperlink w:anchor="_Toc244186995" w:history="1">
+          <w:hyperlink w:anchor="_Toc244187238" w:history="1">
             <w:r>
               <w:rPr>
                 <w:rStyle w:val="Hipervnculo"/>
@@ -1326,7 +1326,7 @@
               <w:rPr>
                 <w:noProof/>
               </w:rPr>
-              <w:instrText xml:space="preserve"> PAGEREF _Toc244186995 \h </w:instrText>
+              <w:instrText xml:space="preserve"> PAGEREF _Toc244187238 \h </w:instrText>
             </w:r>
             <w:r>
               <w:rPr>
@@ -1371,7 +1371,7 @@
               <w14:ligatures w14:val="standardContextual"/>
             </w:rPr>
           </w:pPr>
-          <w:hyperlink w:anchor="_Toc244186996" w:history="1">
+          <w:hyperlink w:anchor="_Toc244187239" w:history="1">
             <w:r>
               <w:rPr>
                 <w:rStyle w:val="Hipervnculo"/>
@@ -1395,7 +1395,7 @@
               <w:rPr>
                 <w:noProof/>
               </w:rPr>
-              <w:instrText xml:space="preserve"> PAGEREF _Toc244186996 \h </w:instrText>
+              <w:instrText xml:space="preserve"> PAGEREF _Toc244187239 \h </w:instrText>
             </w:r>
             <w:r>
               <w:rPr>
@@ -1438,7 +1438,7 @@
               <w14:ligatures w14:val="standardContextual"/>
             </w:rPr>
           </w:pPr>
-          <w:hyperlink w:anchor="_Toc244186997" w:history="1">
+          <w:hyperlink w:anchor="_Toc244187240" w:history="1">
             <w:r>
               <w:rPr>
                 <w:rStyle w:val="Hipervnculo"/>
@@ -1462,7 +1462,7 @@
               <w:rPr>
                 <w:noProof/>
               </w:rPr>
-              <w:instrText xml:space="preserve"> PAGEREF _Toc244186997 \h </w:instrText>
+              <w:instrText xml:space="preserve"> PAGEREF _Toc244187240 \h </w:instrText>
             </w:r>
             <w:r>
               <w:rPr>
@@ -1505,7 +1505,7 @@
               <w14:ligatures w14:val="standardContextual"/>
             </w:rPr>
           </w:pPr>
-          <w:hyperlink w:anchor="_Toc244186998" w:history="1">
+          <w:hyperlink w:anchor="_Toc244187241" w:history="1">
             <w:r>
               <w:rPr>
                 <w:rStyle w:val="Hipervnculo"/>
@@ -1529,7 +1529,7 @@
               <w:rPr>
                 <w:noProof/>
               </w:rPr>
-              <w:instrText xml:space="preserve"> PAGEREF _Toc244186998 \h </w:instrText>
+              <w:instrText xml:space="preserve"> PAGEREF _Toc244187241 \h </w:instrText>
             </w:r>
             <w:r>
               <w:rPr>
@@ -1572,7 +1572,7 @@
               <w14:ligatures w14:val="standardContextual"/>
             </w:rPr>
           </w:pPr>
-          <w:hyperlink w:anchor="_Toc244186999" w:history="1">
+          <w:hyperlink w:anchor="_Toc244187242" w:history="1">
             <w:r>
               <w:rPr>
                 <w:rStyle w:val="Hipervnculo"/>
@@ -1596,7 +1596,7 @@
               <w:rPr>
                 <w:noProof/>
               </w:rPr>
-              <w:instrText xml:space="preserve"> PAGEREF _Toc244186999 \h </w:instrText>
+              <w:instrText xml:space="preserve"> PAGEREF _Toc244187242 \h </w:instrText>
             </w:r>
             <w:r>
               <w:rPr>
@@ -1639,7 +1639,7 @@
               <w14:ligatures w14:val="standardContextual"/>
             </w:rPr>
           </w:pPr>
-          <w:hyperlink w:anchor="_Toc244187000" w:history="1">
+          <w:hyperlink w:anchor="_Toc244187243" w:history="1">
             <w:r>
               <w:rPr>
                 <w:rStyle w:val="Hipervnculo"/>
@@ -1663,7 +1663,7 @@
               <w:rPr>
                 <w:noProof/>
               </w:rPr>
-              <w:instrText xml:space="preserve"> PAGEREF _Toc244187000 \h </w:instrText>
+              <w:instrText xml:space="preserve"> PAGEREF _Toc244187243 \h </w:instrText>
             </w:r>
             <w:r>
               <w:rPr>
@@ -1706,7 +1706,7 @@
               <w14:ligatures w14:val="standardContextual"/>
             </w:rPr>
           </w:pPr>
-          <w:hyperlink w:anchor="_Toc244187001" w:history="1">
+          <w:hyperlink w:anchor="_Toc244187244" w:history="1">
             <w:r>
               <w:rPr>
                 <w:rStyle w:val="Hipervnculo"/>
@@ -1730,7 +1730,7 @@
               <w:rPr>
                 <w:noProof/>
               </w:rPr>
-              <w:instrText xml:space="preserve"> PAGEREF _Toc244187001 \h </w:instrText>
+              <w:instrText xml:space="preserve"> PAGEREF _Toc244187244 \h </w:instrText>
             </w:r>
             <w:r>
               <w:rPr>
@@ -1773,7 +1773,7 @@
               <w14:ligatures w14:val="standardContextual"/>
             </w:rPr>
           </w:pPr>
-          <w:hyperlink w:anchor="_Toc244187002" w:history="1">
+          <w:hyperlink w:anchor="_Toc244187245" w:history="1">
             <w:r>
               <w:rPr>
                 <w:rStyle w:val="Hipervnculo"/>
@@ -1797,7 +1797,7 @@
               <w:rPr>
                 <w:noProof/>
               </w:rPr>
-              <w:instrText xml:space="preserve"> PAGEREF _Toc244187002 \h </w:instrText>
+              <w:instrText xml:space="preserve"> PAGEREF _Toc244187245 \h </w:instrText>
             </w:r>
             <w:r>
               <w:rPr>
@@ -1840,7 +1840,7 @@
               <w14:ligatures w14:val="standardContextual"/>
             </w:rPr>
           </w:pPr>
-          <w:hyperlink w:anchor="_Toc244187003" w:history="1">
+          <w:hyperlink w:anchor="_Toc244187246" w:history="1">
             <w:r>
               <w:rPr>
                 <w:rStyle w:val="Hipervnculo"/>
@@ -1864,7 +1864,7 @@
               <w:rPr>
                 <w:noProof/>
               </w:rPr>
-              <w:instrText xml:space="preserve"> PAGEREF _Toc244187003 \h </w:instrText>
+              <w:instrText xml:space="preserve"> PAGEREF _Toc244187246 \h </w:instrText>
             </w:r>
             <w:r>
               <w:rPr>
@@ -1907,7 +1907,7 @@
               <w14:ligatures w14:val="standardContextual"/>
             </w:rPr>
           </w:pPr>
-          <w:hyperlink w:anchor="_Toc244187004" w:history="1">
+          <w:hyperlink w:anchor="_Toc244187247" w:history="1">
             <w:r>
               <w:rPr>
                 <w:rStyle w:val="Hipervnculo"/>
@@ -1931,7 +1931,7 @@
               <w:rPr>
                 <w:noProof/>
               </w:rPr>
-              <w:instrText xml:space="preserve"> PAGEREF _Toc244187004 \h </w:instrText>
+              <w:instrText xml:space="preserve"> PAGEREF _Toc244187247 \h </w:instrText>
             </w:r>
             <w:r>
               <w:rPr>
@@ -1974,7 +1974,7 @@
               <w14:ligatures w14:val="standardContextual"/>
             </w:rPr>
           </w:pPr>
-          <w:hyperlink w:anchor="_Toc244187005" w:history="1">
+          <w:hyperlink w:anchor="_Toc244187248" w:history="1">
             <w:r>
               <w:rPr>
                 <w:rStyle w:val="Hipervnculo"/>
@@ -1998,7 +1998,7 @@
               <w:rPr>
                 <w:noProof/>
               </w:rPr>
-              <w:instrText xml:space="preserve"> PAGEREF _Toc244187005 \h </w:instrText>
+              <w:instrText xml:space="preserve"> PAGEREF _Toc244187248 \h </w:instrText>
             </w:r>
             <w:r>
               <w:rPr>
@@ -2043,7 +2043,7 @@
               <w14:ligatures w14:val="standardContextual"/>
             </w:rPr>
           </w:pPr>
-          <w:hyperlink w:anchor="_Toc244187006" w:history="1">
+          <w:hyperlink w:anchor="_Toc244187249" w:history="1">
             <w:r>
               <w:rPr>
                 <w:rStyle w:val="Hipervnculo"/>
@@ -2067,7 +2067,7 @@
               <w:rPr>
                 <w:noProof/>
               </w:rPr>
-              <w:instrText xml:space="preserve"> PAGEREF _Toc244187006 \h </w:instrText>
+              <w:instrText xml:space="preserve"> PAGEREF _Toc244187249 \h </w:instrText>
             </w:r>
             <w:r>
               <w:rPr>
@@ -2110,7 +2110,7 @@
               <w14:ligatures w14:val="standardContextual"/>
             </w:rPr>
           </w:pPr>
-          <w:hyperlink w:anchor="_Toc244187007" w:history="1">
+          <w:hyperlink w:anchor="_Toc244187250" w:history="1">
             <w:r>
               <w:rPr>
                 <w:rStyle w:val="Hipervnculo"/>
@@ -2134,7 +2134,7 @@
               <w:rPr>
                 <w:noProof/>
               </w:rPr>
-              <w:instrText xml:space="preserve"> PAGEREF _Toc244187007 \h </w:instrText>
+              <w:instrText xml:space="preserve"> PAGEREF _Toc244187250 \h </w:instrText>
             </w:r>
             <w:r>
               <w:rPr>
@@ -2177,7 +2177,7 @@
               <w14:ligatures w14:val="standardContextual"/>
             </w:rPr>
           </w:pPr>
-          <w:hyperlink w:anchor="_Toc244187008" w:history="1">
+          <w:hyperlink w:anchor="_Toc244187251" w:history="1">
             <w:r>
               <w:rPr>
                 <w:rStyle w:val="Hipervnculo"/>
@@ -2201,7 +2201,7 @@
               <w:rPr>
                 <w:noProof/>
               </w:rPr>
-              <w:instrText xml:space="preserve"> PAGEREF _Toc244187008 \h </w:instrText>
+              <w:instrText xml:space="preserve"> PAGEREF _Toc244187251 \h </w:instrText>
             </w:r>
             <w:r>
               <w:rPr>
@@ -2244,7 +2244,7 @@
               <w14:ligatures w14:val="standardContextual"/>
             </w:rPr>
           </w:pPr>
-          <w:hyperlink w:anchor="_Toc244187009" w:history="1">
+          <w:hyperlink w:anchor="_Toc244187252" w:history="1">
             <w:r>
               <w:rPr>
                 <w:rStyle w:val="Hipervnculo"/>
@@ -2268,7 +2268,7 @@
               <w:rPr>
                 <w:noProof/>
               </w:rPr>
-              <w:instrText xml:space="preserve"> PAGEREF _Toc244187009 \h </w:instrText>
+              <w:instrText xml:space="preserve"> PAGEREF _Toc244187252 \h </w:instrText>
             </w:r>
             <w:r>
               <w:rPr>
@@ -2311,7 +2311,7 @@
               <w14:ligatures w14:val="standardContextual"/>
             </w:rPr>
           </w:pPr>
-          <w:hyperlink w:anchor="_Toc244187010" w:history="1">
+          <w:hyperlink w:anchor="_Toc244187253" w:history="1">
             <w:r>
               <w:rPr>
                 <w:rStyle w:val="Hipervnculo"/>
@@ -2335,7 +2335,7 @@
               <w:rPr>
                 <w:noProof/>
               </w:rPr>
-              <w:instrText xml:space="preserve"> PAGEREF _Toc244187010 \h </w:instrText>
+              <w:instrText xml:space="preserve"> PAGEREF _Toc244187253 \h </w:instrText>
             </w:r>
             <w:r>
               <w:rPr>
@@ -2378,7 +2378,7 @@
               <w14:ligatures w14:val="standardContextual"/>
             </w:rPr>
           </w:pPr>
-          <w:hyperlink w:anchor="_Toc244187011" w:history="1">
+          <w:hyperlink w:anchor="_Toc244187254" w:history="1">
             <w:r>
               <w:rPr>
                 <w:rStyle w:val="Hipervnculo"/>
@@ -2402,7 +2402,7 @@
               <w:rPr>
                 <w:noProof/>
               </w:rPr>
-              <w:instrText xml:space="preserve"> PAGEREF _Toc244187011 \h </w:instrText>
+              <w:instrText xml:space="preserve"> PAGEREF _Toc244187254 \h </w:instrText>
             </w:r>
             <w:r>
               <w:rPr>
@@ -2445,7 +2445,7 @@
               <w14:ligatures w14:val="standardContextual"/>
             </w:rPr>
           </w:pPr>
-          <w:hyperlink w:anchor="_Toc244187012" w:history="1">
+          <w:hyperlink w:anchor="_Toc244187255" w:history="1">
             <w:r>
               <w:rPr>
                 <w:rStyle w:val="Hipervnculo"/>
@@ -2469,7 +2469,7 @@
               <w:rPr>
                 <w:noProof/>
               </w:rPr>
-              <w:instrText xml:space="preserve"> PAGEREF _Toc244187012 \h </w:instrText>
+              <w:instrText xml:space="preserve"> PAGEREF _Toc244187255 \h </w:instrText>
             </w:r>
             <w:r>
               <w:rPr>
@@ -2512,7 +2512,7 @@
               <w14:ligatures w14:val="standardContextual"/>
             </w:rPr>
           </w:pPr>
-          <w:hyperlink w:anchor="_Toc244187013" w:history="1">
+          <w:hyperlink w:anchor="_Toc244187256" w:history="1">
             <w:r>
               <w:rPr>
                 <w:rStyle w:val="Hipervnculo"/>
@@ -2536,7 +2536,7 @@
               <w:rPr>
                 <w:noProof/>
               </w:rPr>
-              <w:instrText xml:space="preserve"> PAGEREF _Toc244187013 \h </w:instrText>
+              <w:instrText xml:space="preserve"> PAGEREF _Toc244187256 \h </w:instrText>
             </w:r>
             <w:r>
               <w:rPr>
@@ -2579,7 +2579,7 @@
               <w14:ligatures w14:val="standardContextual"/>
             </w:rPr>
           </w:pPr>
-          <w:hyperlink w:anchor="_Toc244187014" w:history="1">
+          <w:hyperlink w:anchor="_Toc244187257" w:history="1">
             <w:r>
               <w:rPr>
                 <w:rStyle w:val="Hipervnculo"/>
@@ -2603,7 +2603,7 @@
               <w:rPr>
                 <w:noProof/>
               </w:rPr>
-              <w:instrText xml:space="preserve"> PAGEREF _Toc244187014 \h </w:instrText>
+              <w:instrText xml:space="preserve"> PAGEREF _Toc244187257 \h </w:instrText>
             </w:r>
             <w:r>
               <w:rPr>
@@ -2648,7 +2648,7 @@
               <w14:ligatures w14:val="standardContextual"/>
             </w:rPr>
           </w:pPr>
-          <w:hyperlink w:anchor="_Toc244187015" w:history="1">
+          <w:hyperlink w:anchor="_Toc244187258" w:history="1">
             <w:r>
               <w:rPr>
                 <w:rStyle w:val="Hipervnculo"/>
@@ -2672,7 +2672,7 @@
               <w:rPr>
                 <w:noProof/>
               </w:rPr>
-              <w:instrText xml:space="preserve"> PAGEREF _Toc244187015 \h </w:instrText>
+              <w:instrText xml:space="preserve"> PAGEREF _Toc244187258 \h </w:instrText>
             </w:r>
             <w:r>
               <w:rPr>
@@ -2717,7 +2717,7 @@
               <w14:ligatures w14:val="standardContextual"/>
             </w:rPr>
           </w:pPr>
-          <w:hyperlink w:anchor="_Toc244187016" w:history="1">
+          <w:hyperlink w:anchor="_Toc244187259" w:history="1">
             <w:r>
               <w:rPr>
                 <w:rStyle w:val="Hipervnculo"/>
@@ -2741,7 +2741,7 @@
               <w:rPr>
                 <w:noProof/>
               </w:rPr>
-              <w:instrText xml:space="preserve"> PAGEREF _Toc244187016 \h </w:instrText>
+              <w:instrText xml:space="preserve"> PAGEREF _Toc244187259 \h </w:instrText>
             </w:r>
             <w:r>
               <w:rPr>
@@ -2786,7 +2786,7 @@
               <w14:ligatures w14:val="standardContextual"/>
             </w:rPr>
           </w:pPr>
-          <w:hyperlink w:anchor="_Toc244187017" w:history="1">
+          <w:hyperlink w:anchor="_Toc244187260" w:history="1">
             <w:r>
               <w:rPr>
                 <w:rStyle w:val="Hipervnculo"/>
@@ -2810,7 +2810,7 @@
               <w:rPr>
                 <w:noProof/>
               </w:rPr>
-              <w:instrText xml:space="preserve"> PAGEREF _Toc244187017 \h </w:instrText>
+              <w:instrText xml:space="preserve"> PAGEREF _Toc244187260 \h </w:instrText>
             </w:r>
             <w:r>
               <w:rPr>
@@ -2855,7 +2855,7 @@
               <w14:ligatures w14:val="standardContextual"/>
             </w:rPr>
           </w:pPr>
-          <w:hyperlink w:anchor="_Toc244187018" w:history="1">
+          <w:hyperlink w:anchor="_Toc244187261" w:history="1">
             <w:r>
               <w:rPr>
                 <w:rStyle w:val="Hipervnculo"/>
@@ -2879,7 +2879,7 @@
               <w:rPr>
                 <w:noProof/>
               </w:rPr>
-              <w:instrText xml:space="preserve"> PAGEREF _Toc244187018 \h </w:instrText>
+              <w:instrText xml:space="preserve"> PAGEREF _Toc244187261 \h </w:instrText>
             </w:r>
             <w:r>
               <w:rPr>
@@ -2924,7 +2924,7 @@
               <w14:ligatures w14:val="standardContextual"/>
             </w:rPr>
           </w:pPr>
-          <w:hyperlink w:anchor="_Toc244187019" w:history="1">
+          <w:hyperlink w:anchor="_Toc244187262" w:history="1">
             <w:r>
               <w:rPr>
                 <w:rStyle w:val="Hipervnculo"/>
@@ -2948,7 +2948,7 @@
               <w:rPr>
                 <w:noProof/>
               </w:rPr>
-              <w:instrText xml:space="preserve"> PAGEREF _Toc244187019 \h </w:instrText>
+              <w:instrText xml:space="preserve"> PAGEREF _Toc244187262 \h </w:instrText>
             </w:r>
             <w:r>
               <w:rPr>
@@ -2965,7 +2965,7 @@
               <w:rPr>
                 <w:noProof/>
               </w:rPr>
-              <w:t>55</w:t>
+              <w:t>56</w:t>
             </w:r>
             <w:r>
               <w:rPr>
@@ -2993,7 +2993,7 @@
               <w14:ligatures w14:val="standardContextual"/>
             </w:rPr>
           </w:pPr>
-          <w:hyperlink w:anchor="_Toc244187020" w:history="1">
+          <w:hyperlink w:anchor="_Toc244187263" w:history="1">
             <w:r>
               <w:rPr>
                 <w:rStyle w:val="Hipervnculo"/>
@@ -3017,7 +3017,7 @@
               <w:rPr>
                 <w:noProof/>
               </w:rPr>
-              <w:instrText xml:space="preserve"> PAGEREF _Toc244187020 \h </w:instrText>
+              <w:instrText xml:space="preserve"> PAGEREF _Toc244187263 \h </w:instrText>
             </w:r>
             <w:r>
               <w:rPr>
@@ -3062,7 +3062,7 @@
               <w14:ligatures w14:val="standardContextual"/>
             </w:rPr>
           </w:pPr>
-          <w:hyperlink w:anchor="_Toc244187021" w:history="1">
+          <w:hyperlink w:anchor="_Toc244187264" w:history="1">
             <w:r>
               <w:rPr>
                 <w:rStyle w:val="Hipervnculo"/>
@@ -3086,7 +3086,7 @@
               <w:rPr>
                 <w:noProof/>
               </w:rPr>
-              <w:instrText xml:space="preserve"> PAGEREF _Toc244187021 \h </w:instrText>
+              <w:instrText xml:space="preserve"> PAGEREF _Toc244187264 \h </w:instrText>
             </w:r>
             <w:r>
               <w:rPr>
@@ -3125,7 +3125,7 @@
         <w:pStyle w:val="Ttulo1"/>
         <w:pageBreakBefore/>
       </w:pPr>
-      <w:bookmarkStart w:id="1" w:name="_Toc244186983"/>
+      <w:bookmarkStart w:id="1" w:name="_Toc244187226"/>
       <w:r>
         <w:t>La propuesta en una página</w:t>
       </w:r>
@@ -3401,7 +3401,7 @@
         <w:pStyle w:val="Ttulo1"/>
         <w:pageBreakBefore/>
       </w:pPr>
-      <w:bookmarkStart w:id="2" w:name="_Toc244186984"/>
+      <w:bookmarkStart w:id="2" w:name="_Toc244187227"/>
       <w:r>
         <w:t>1. Introducción</w:t>
       </w:r>
@@ -3411,7 +3411,7 @@
       <w:pPr>
         <w:pStyle w:val="Ttulo2"/>
       </w:pPr>
-      <w:bookmarkStart w:id="3" w:name="_Toc244186985"/>
+      <w:bookmarkStart w:id="3" w:name="_Toc244187228"/>
       <w:r>
         <w:t>1.1 El problema</w:t>
       </w:r>
@@ -4545,7 +4545,7 @@
       <w:pPr>
         <w:pStyle w:val="Ttulo2"/>
       </w:pPr>
-      <w:bookmarkStart w:id="4" w:name="_Toc244186986"/>
+      <w:bookmarkStart w:id="4" w:name="_Toc244187229"/>
       <w:r>
         <w:t>1.2 Base fisiológica y anatómica</w:t>
       </w:r>
@@ -4586,7 +4586,7 @@
           <w:noProof/>
         </w:rPr>
         <w:drawing>
-          <wp:inline distT="0" distB="0" distL="0" distR="0" wp14:anchorId="1A93CF8E" wp14:editId="338E41EB">
+          <wp:inline distT="0" distB="0" distL="0" distR="0" wp14:anchorId="7A42E3FC" wp14:editId="73312C5C">
             <wp:extent cx="5905500" cy="2390775"/>
             <wp:effectExtent l="0" t="0" r="0" b="0"/>
             <wp:docPr id="1" name="f09-bucle-glicemia.png" descr="Bucle de control de la glicemia según el Tema 2 del curso, y dónde entra el medidor propuesto." title="Figura 1"/>
@@ -4804,7 +4804,7 @@
       <w:pPr>
         <w:pStyle w:val="Ttulo2"/>
       </w:pPr>
-      <w:bookmarkStart w:id="5" w:name="_Toc244186987"/>
+      <w:bookmarkStart w:id="5" w:name="_Toc244187230"/>
       <w:r>
         <w:t>1.3 Antecedentes: el seminario y GlucoWatch</w:t>
       </w:r>
@@ -4847,7 +4847,7 @@
           <w:noProof/>
         </w:rPr>
         <w:drawing>
-          <wp:inline distT="0" distB="0" distL="0" distR="0" wp14:anchorId="7383AB36" wp14:editId="1D4C2477">
+          <wp:inline distT="0" distB="0" distL="0" distR="0" wp14:anchorId="407FC254" wp14:editId="004EE291">
             <wp:extent cx="5905500" cy="3571875"/>
             <wp:effectExtent l="0" t="0" r="0" b="0"/>
             <wp:docPr id="2" name="f01-mapa-tecnologias.png" descr="Tecnologías no invasivas agrupadas en las tres familias de Tang et al. (2020). El color indica qué tan específica es la señal para la glucosa, según el ranking de viabilidad del documento de trabajo del autor. Las que ese ranking no evalúa van en blanco." title="Figura 2"/>
@@ -6293,7 +6293,7 @@
       <w:pPr>
         <w:pStyle w:val="Ttulo2"/>
       </w:pPr>
-      <w:bookmarkStart w:id="6" w:name="_Toc244186988"/>
+      <w:bookmarkStart w:id="6" w:name="_Toc244187231"/>
       <w:r>
         <w:t>1.4 Pregunta, hipótesis y objetivos</w:t>
       </w:r>
@@ -6496,7 +6496,7 @@
         <w:pStyle w:val="Ttulo1"/>
         <w:pageBreakBefore/>
       </w:pPr>
-      <w:bookmarkStart w:id="7" w:name="_Toc244186989"/>
+      <w:bookmarkStart w:id="7" w:name="_Toc244187232"/>
       <w:r>
         <w:t>2. Métodos</w:t>
       </w:r>
@@ -6506,7 +6506,7 @@
       <w:pPr>
         <w:pStyle w:val="Ttulo2"/>
       </w:pPr>
-      <w:bookmarkStart w:id="8" w:name="_Toc244186990"/>
+      <w:bookmarkStart w:id="8" w:name="_Toc244187233"/>
       <w:r>
         <w:t>2.1 Metodología dry lab</w:t>
       </w:r>
@@ -6741,7 +6741,7 @@
       <w:pPr>
         <w:pStyle w:val="Ttulo2"/>
       </w:pPr>
-      <w:bookmarkStart w:id="9" w:name="_Toc244186991"/>
+      <w:bookmarkStart w:id="9" w:name="_Toc244187234"/>
       <w:r>
         <w:t>2.2 Criterios de decisión</w:t>
       </w:r>
@@ -8009,7 +8009,7 @@
       <w:pPr>
         <w:pStyle w:val="Ttulo2"/>
       </w:pPr>
-      <w:bookmarkStart w:id="10" w:name="_Toc244186992"/>
+      <w:bookmarkStart w:id="10" w:name="_Toc244187235"/>
       <w:r>
         <w:t>2.3 La propuesta completa del medidor</w:t>
       </w:r>
@@ -8044,7 +8044,7 @@
           <w:noProof/>
         </w:rPr>
         <w:drawing>
-          <wp:inline distT="0" distB="0" distL="0" distR="0" wp14:anchorId="0D1FA7CD" wp14:editId="12750A4A">
+          <wp:inline distT="0" distB="0" distL="0" distR="0" wp14:anchorId="6D56842E" wp14:editId="2B19B8B2">
             <wp:extent cx="5905500" cy="2819400"/>
             <wp:effectExtent l="0" t="0" r="0" b="0"/>
             <wp:docPr id="3" name="f03-arquitectura-medidor.png" descr="Arquitectura propuesta. La vía óptica estima la glucosa en sangre, la vía del oído detecta cómo reacciona el cerebro. El recuadro punteado es lo único que hoy existe, y solo en simulación." title="Figura 3"/>
@@ -8883,7 +8883,7 @@
       <w:pPr>
         <w:pStyle w:val="Ttulo2"/>
       </w:pPr>
-      <w:bookmarkStart w:id="11" w:name="_Toc244186993"/>
+      <w:bookmarkStart w:id="11" w:name="_Toc244187236"/>
       <w:r>
         <w:t>2.4 Trazabilidad fisiológica</w:t>
       </w:r>
@@ -9573,7 +9573,7 @@
       <w:pPr>
         <w:pStyle w:val="Ttulo2"/>
       </w:pPr>
-      <w:bookmarkStart w:id="12" w:name="_Toc244186994"/>
+      <w:bookmarkStart w:id="12" w:name="_Toc244187237"/>
       <w:r>
         <w:t>2.5 La tomografía del retraso</w:t>
       </w:r>
@@ -9624,7 +9624,7 @@
           <w:noProof/>
         </w:rPr>
         <w:drawing>
-          <wp:inline distT="0" distB="0" distL="0" distR="0" wp14:anchorId="2F186FCE" wp14:editId="57861125">
+          <wp:inline distT="0" distB="0" distL="0" distR="0" wp14:anchorId="14CF60C1" wp14:editId="72BF88A7">
             <wp:extent cx="5905500" cy="3000375"/>
             <wp:effectExtent l="0" t="0" r="0" b="0"/>
             <wp:docPr id="4" name="f02-dos-profundidades.png" descr="Izquierda, el esquema. Derecha, la curva sintética que usa el repositorio: la sangre sube con una comida a los 90 minutos y baja a 50 mg/dL a los 300. Cada profundidad ve la misma curva, más tarde y más suavizada." title="Figura 4"/>
@@ -9855,7 +9855,7 @@
       <w:pPr>
         <w:pStyle w:val="Ttulo2"/>
       </w:pPr>
-      <w:bookmarkStart w:id="13" w:name="_Toc244186995"/>
+      <w:bookmarkStart w:id="13" w:name="_Toc244187238"/>
       <w:r>
         <w:t>2.6 Diseño de la simulación</w:t>
       </w:r>
@@ -11455,7 +11455,7 @@
         <w:pStyle w:val="Ttulo1"/>
         <w:pageBreakBefore/>
       </w:pPr>
-      <w:bookmarkStart w:id="14" w:name="_Toc244186996"/>
+      <w:bookmarkStart w:id="14" w:name="_Toc244187239"/>
       <w:r>
         <w:t>3. Resultados</w:t>
       </w:r>
@@ -11517,7 +11517,7 @@
           <w:noProof/>
         </w:rPr>
         <w:drawing>
-          <wp:inline distT="0" distB="0" distL="0" distR="0" wp14:anchorId="4D4C9414" wp14:editId="0DD9A2BA">
+          <wp:inline distT="0" distB="0" distL="0" distR="0" wp14:anchorId="38EA65E1" wp14:editId="13534248">
             <wp:extent cx="5905500" cy="3305175"/>
             <wp:effectExtent l="0" t="0" r="0" b="0"/>
             <wp:docPr id="5" name="f05-registro-representativo.png" descr="Una réplica del escenario típico con ruido de 5 mg/dL, elegida antes de ver los resultados. En azul la reconstrucción con dos profundidades, en gris una sola profundidad suavizada. Figura generada por el repositorio." title="Figura 5"/>
@@ -11583,7 +11583,7 @@
       <w:pPr>
         <w:pStyle w:val="Ttulo2"/>
       </w:pPr>
-      <w:bookmarkStart w:id="15" w:name="_Toc244186997"/>
+      <w:bookmarkStart w:id="15" w:name="_Toc244187240"/>
       <w:r>
         <w:t>3.1 ¿Se recuperan los retrasos?</w:t>
       </w:r>
@@ -11600,7 +11600,7 @@
           <w:noProof/>
         </w:rPr>
         <w:drawing>
-          <wp:inline distT="0" distB="0" distL="0" distR="0" wp14:anchorId="71447CC7" wp14:editId="6B73DBDF">
+          <wp:inline distT="0" distB="0" distL="0" distR="0" wp14:anchorId="7C2279F4" wp14:editId="51AD6F83">
             <wp:extent cx="5905500" cy="2238375"/>
             <wp:effectExtent l="0" t="0" r="0" b="0"/>
             <wp:docPr id="6" name="f06-retrasos-estimados.png" descr="Retraso estimado, media ± desviación estándar entre las corridas válidas, frente al valor real (raya negra). En rojo, los escenarios donde parte de las corridas falló." title="Figura 6"/>
@@ -13294,7 +13294,7 @@
       <w:pPr>
         <w:pStyle w:val="Ttulo2"/>
       </w:pPr>
-      <w:bookmarkStart w:id="16" w:name="_Toc244186998"/>
+      <w:bookmarkStart w:id="16" w:name="_Toc244187241"/>
       <w:r>
         <w:t>3.2 ¿Cuánto ruido tolera el sensor?</w:t>
       </w:r>
@@ -13311,7 +13311,7 @@
           <w:noProof/>
         </w:rPr>
         <w:drawing>
-          <wp:inline distT="0" distB="0" distL="0" distR="0" wp14:anchorId="56C6E455" wp14:editId="2732877E">
+          <wp:inline distT="0" distB="0" distL="0" distR="0" wp14:anchorId="059BE7C2" wp14:editId="4916B7EC">
             <wp:extent cx="5905500" cy="3514725"/>
             <wp:effectExtent l="0" t="0" r="0" b="0"/>
             <wp:docPr id="7" name="f07-requisito-ruido.png" descr="Error de la glucosa reconstruida en la persona típica. Con poco ruido, dos profundidades ganan. Sobre unos 5,9 mg/dL, corregir el retraso empeora el resultado. El cruce sale de solo tres niveles de ruido." title="Figura 7"/>
@@ -13395,7 +13395,7 @@
       <w:pPr>
         <w:pStyle w:val="Ttulo2"/>
       </w:pPr>
-      <w:bookmarkStart w:id="17" w:name="_Toc244186999"/>
+      <w:bookmarkStart w:id="17" w:name="_Toc244187242"/>
       <w:r>
         <w:t>3.3 ¿La alarma suena antes?</w:t>
       </w:r>
@@ -13445,7 +13445,7 @@
       <w:pPr>
         <w:pStyle w:val="Ttulo2"/>
       </w:pPr>
-      <w:bookmarkStart w:id="18" w:name="_Toc244187000"/>
+      <w:bookmarkStart w:id="18" w:name="_Toc244187243"/>
       <w:r>
         <w:t>3.4 Umbral por umbral</w:t>
       </w:r>
@@ -14950,7 +14950,7 @@
       <w:pPr>
         <w:pStyle w:val="Ttulo2"/>
       </w:pPr>
-      <w:bookmarkStart w:id="19" w:name="_Toc244187001"/>
+      <w:bookmarkStart w:id="19" w:name="_Toc244187244"/>
       <w:r>
         <w:t>3.5 Límites por tecnología</w:t>
       </w:r>
@@ -14975,7 +14975,7 @@
           <w:noProof/>
         </w:rPr>
         <w:drawing>
-          <wp:inline distT="0" distB="0" distL="0" distR="0" wp14:anchorId="5884B4DA" wp14:editId="761B055B">
+          <wp:inline distT="0" distB="0" distL="0" distR="0" wp14:anchorId="079AA64A" wp14:editId="52EA1848">
             <wp:extent cx="6096000" cy="3248025"/>
             <wp:effectExtent l="0" t="0" r="0" b="0"/>
             <wp:docPr id="8" name="f11-evidencia.png" descr="Mejor evidencia por tecnología. La línea roja es la regla 1 (15 %). La franja ámbar es el rango de los CGM medido por grupos independientes (11,6 a 12 %) y la línea gris es lo que declaran las empresas (unos 8 %). Know Labs y DIROS no se grafican porque no informan participantes o MARD. En algunos puntos se corrió un poco la posición horizontal para que no se tapen." title="Figura 8"/>
@@ -17713,7 +17713,7 @@
       <w:pPr>
         <w:pStyle w:val="Ttulo2"/>
       </w:pPr>
-      <w:bookmarkStart w:id="20" w:name="_Toc244187002"/>
+      <w:bookmarkStart w:id="20" w:name="_Toc244187245"/>
       <w:r>
         <w:t>3.6 Límites físicos, calculados a mano</w:t>
       </w:r>
@@ -19297,7 +19297,7 @@
           <w:noProof/>
         </w:rPr>
         <w:drawing>
-          <wp:inline distT="0" distB="0" distL="0" distR="0" wp14:anchorId="05A95F0F" wp14:editId="4DB0849C">
+          <wp:inline distT="0" distB="0" distL="0" distR="0" wp14:anchorId="79B27338" wp14:editId="4DFB2F38">
             <wp:extent cx="6096000" cy="2886075"/>
             <wp:effectExtent l="0" t="0" r="0" b="0"/>
             <wp:docPr id="9" name="f10-profundidades.png" descr="Capas de la piel de antebrazo y profundidad que muestrea cada tecnología, con eje logarítmico. Fuentes: Sandby-Møller et al. (2003), Kottmann et al. (2016), Uluç et al. (2024), Zhang et al. (2025), Lundsgaard-Nielsen et al. (2018), Prlić et al. (2022) y Ahmad et al. (2025). El espesor de la dermis y la profundidad del CGM subcutáneo no se extrajeron de las fuentes." title="Figura 9"/>
@@ -21445,7 +21445,7 @@
       <w:pPr>
         <w:pStyle w:val="Ttulo2"/>
       </w:pPr>
-      <w:bookmarkStart w:id="21" w:name="_Toc244187003"/>
+      <w:bookmarkStart w:id="21" w:name="_Toc244187246"/>
       <w:r>
         <w:t>3.7 Límites prácticos</w:t>
       </w:r>
@@ -21812,7 +21812,7 @@
                 <w:sz w:val="19"/>
                 <w:szCs w:val="19"/>
               </w:rPr>
-              <w:t>DIROS: 1,5 min por espectro. Raman de RSP: unos 3 min. DiaMonTech: 4 min, con meta de 10 a 20 s. mμSORS: 8 min. Raman de Kang: 285 s por cuadro</w:t>
+              <w:t>DIROS: 1,5 min por espectro. Raman de RSP: unos 3 min. DiaMonTech: 4 min, con meta de 10 a 20 s. mμSORS: 8 min (dato de una nota de prensa). Raman de Kang: 285 s por cuadro</w:t>
             </w:r>
           </w:p>
         </w:tc>
@@ -22218,7 +22218,7 @@
       <w:pPr>
         <w:pStyle w:val="Ttulo2"/>
       </w:pPr>
-      <w:bookmarkStart w:id="22" w:name="_Toc244187004"/>
+      <w:bookmarkStart w:id="22" w:name="_Toc244187247"/>
       <w:r>
         <w:t>3.8 Fusión y redundancia</w:t>
       </w:r>
@@ -22251,7 +22251,7 @@
           <w:noProof/>
         </w:rPr>
         <w:drawing>
-          <wp:inline distT="0" distB="0" distL="0" distR="0" wp14:anchorId="07DC3D6D" wp14:editId="272D2F87">
+          <wp:inline distT="0" distB="0" distL="0" distR="0" wp14:anchorId="384F4532" wp14:editId="541E5E70">
             <wp:extent cx="5715000" cy="3238500"/>
             <wp:effectExtent l="0" t="0" r="0" b="0"/>
             <wp:docPr id="10" name="f12-fusion.png" descr="Ruido fusionado sobre ruido de un solo sensor, según el número de sensores iguales y la correlación entre sus errores. Las líneas punteadas son los límites √ρ. Los puntos son los dos valores de ρ estimados con la redundancia de dos electrodos de un CGM (Sharifi et al., 2016)." title="Figura 10"/>
@@ -29130,7 +29130,7 @@
           <w:noProof/>
         </w:rPr>
         <w:drawing>
-          <wp:inline distT="0" distB="0" distL="0" distR="0" wp14:anchorId="0B8518FA" wp14:editId="0C1BD483">
+          <wp:inline distT="0" distB="0" distL="0" distR="0" wp14:anchorId="2C19CF46" wp14:editId="75316913">
             <wp:extent cx="6096000" cy="3343275"/>
             <wp:effectExtent l="0" t="0" r="0" b="0"/>
             <wp:docPr id="11" name="f13-alarmas.png" descr="Sensibilidad frente a valor predictivo positivo, con 0,54 eventos nocturnos por semana. La zona azul es la exigencia de la regla 0 y de R-B (85 % o más y 70 % o más). Los círculos llenos son vías solas y los vacíos son combinaciones. El punto 1' marca a GlucoWatch con el VPP del estudio. Todo lo que sale rojo queda fuera de la zona." title="Figura 11"/>
@@ -35182,7 +35182,7 @@
       <w:pPr>
         <w:pStyle w:val="Ttulo2"/>
       </w:pPr>
-      <w:bookmarkStart w:id="23" w:name="_Toc244187005"/>
+      <w:bookmarkStart w:id="23" w:name="_Toc244187248"/>
       <w:r>
         <w:t>3.9 Comparación con el mercado</w:t>
       </w:r>
@@ -38057,7 +38057,7 @@
         <w:pStyle w:val="Ttulo1"/>
         <w:pageBreakBefore/>
       </w:pPr>
-      <w:bookmarkStart w:id="24" w:name="_Toc244187006"/>
+      <w:bookmarkStart w:id="24" w:name="_Toc244187249"/>
       <w:r>
         <w:t>4. Discusión</w:t>
       </w:r>
@@ -38067,7 +38067,7 @@
       <w:pPr>
         <w:pStyle w:val="Ttulo2"/>
       </w:pPr>
-      <w:bookmarkStart w:id="25" w:name="_Toc244187007"/>
+      <w:bookmarkStart w:id="25" w:name="_Toc244187250"/>
       <w:r>
         <w:t>4.1 Qué significan los resultados</w:t>
       </w:r>
@@ -38238,7 +38238,7 @@
       <w:pPr>
         <w:pStyle w:val="Ttulo2"/>
       </w:pPr>
-      <w:bookmarkStart w:id="26" w:name="_Toc244187008"/>
+      <w:bookmarkStart w:id="26" w:name="_Toc244187251"/>
       <w:r>
         <w:t>4.2 Rango de efectividad realista</w:t>
       </w:r>
@@ -39321,7 +39321,7 @@
       <w:pPr>
         <w:pStyle w:val="Ttulo2"/>
       </w:pPr>
-      <w:bookmarkStart w:id="27" w:name="_Toc244187009"/>
+      <w:bookmarkStart w:id="27" w:name="_Toc244187252"/>
       <w:r>
         <w:t>4.3 Veredicto</w:t>
       </w:r>
@@ -39981,7 +39981,7 @@
                 <w:sz w:val="19"/>
                 <w:szCs w:val="19"/>
               </w:rPr>
-              <w:t>Ninguna versión portátil para dormir sin calibración diaria. DiaMonTech es del tamaño de una caja de zapatos, mμSORS es de escritorio con 8 min por medición, DIROS es de mesa. Un Raman de 300 mW necesita un haz de al menos 10 mm si vale el límite aplicado</w:t>
+              <w:t>Ninguna versión portátil para dormir sin calibración diaria. DiaMonTech es del tamaño de una caja de zapatos, mμSORS es de escritorio con 8 min por medición (dato de una nota de prensa), DIROS es de mesa. Un Raman de 300 mW necesita un haz de al menos 10 mm si vale el límite aplicado</w:t>
             </w:r>
           </w:p>
         </w:tc>
@@ -41339,7 +41339,7 @@
                 <w:sz w:val="19"/>
                 <w:szCs w:val="19"/>
               </w:rPr>
-              <w:t>El Raman sin calibrar llega a 14,5 y 14,6 %, bajo el 20 % que pide el rubro, pero es de escritorio, tarda 8 min y no hay datos de dirección de la tendencia. El infrarrojo medio da 19,6 y 20,7 %, en el borde, con calibración. Un CGM de venta libre cuesta USD 54 por 2 semanas, y el no invasivo no tiene precio hallado. Fallan las reglas 5 y 6</w:t>
+              <w:t>El Raman sin calibrar llega a 14,5 y 14,6 %, bajo el 20 % que pide el rubro, pero es de escritorio, tarda 8 min (dato de una nota de prensa) y no hay datos de dirección de la tendencia. El infrarrojo medio da 19,6 y 20,7 %, en el borde, con calibración. Un CGM de venta libre cuesta USD 54 por 2 semanas, y el no invasivo no tiene precio hallado. Fallan las reglas 5 y 6</w:t>
             </w:r>
           </w:p>
         </w:tc>
@@ -41533,14 +41533,14 @@
         <w:spacing w:after="140" w:line="300" w:lineRule="auto"/>
       </w:pPr>
       <w:r>
-        <w:t>Ninguno de los tres rubros es condicional, porque en todos falla la regla 5, que exigen hardware que el equipo no tiene. Un experimento barato solo existiría si faltara una medición que ya se pudiera hacer con datos disponibles.</w:t>
+        <w:t>Ninguno de los tres rubros es condicional, porque en todos falla la regla 5: nadie ha demostrado todavía un equipo portátil para uso nocturno, y eso no se resuelve con un experimento barato. Un experimento barato solo existiría si faltara una medición que ya se pudiera hacer con datos disponibles.</w:t>
       </w:r>
     </w:p>
     <w:p>
       <w:pPr>
         <w:pStyle w:val="Ttulo2"/>
       </w:pPr>
-      <w:bookmarkStart w:id="28" w:name="_Toc244187010"/>
+      <w:bookmarkStart w:id="28" w:name="_Toc244187253"/>
       <w:r>
         <w:t>4.4 Qué sí podría tener sentido (Propuesta)</w:t>
       </w:r>
@@ -41765,7 +41765,7 @@
       <w:pPr>
         <w:pStyle w:val="Ttulo2"/>
       </w:pPr>
-      <w:bookmarkStart w:id="29" w:name="_Toc244187011"/>
+      <w:bookmarkStart w:id="29" w:name="_Toc244187254"/>
       <w:r>
         <w:t>4.5 Límites de este análisis</w:t>
       </w:r>
@@ -41959,7 +41959,7 @@
       <w:pPr>
         <w:pStyle w:val="Ttulo2"/>
       </w:pPr>
-      <w:bookmarkStart w:id="30" w:name="_Toc244187012"/>
+      <w:bookmarkStart w:id="30" w:name="_Toc244187255"/>
       <w:r>
         <w:t>4.6 Limitaciones de la simulación</w:t>
       </w:r>
@@ -42103,7 +42103,7 @@
       <w:pPr>
         <w:pStyle w:val="Ttulo2"/>
       </w:pPr>
-      <w:bookmarkStart w:id="31" w:name="_Toc244187013"/>
+      <w:bookmarkStart w:id="31" w:name="_Toc244187256"/>
       <w:r>
         <w:t>4.7 Traslación a un dispositivo de uso clínico</w:t>
       </w:r>
@@ -42210,7 +42210,7 @@
       <w:pPr>
         <w:pStyle w:val="Ttulo2"/>
       </w:pPr>
-      <w:bookmarkStart w:id="32" w:name="_Toc244187014"/>
+      <w:bookmarkStart w:id="32" w:name="_Toc244187257"/>
       <w:r>
         <w:t>4.8 Próximos pasos</w:t>
       </w:r>
@@ -42227,7 +42227,7 @@
           <w:noProof/>
         </w:rPr>
         <w:drawing>
-          <wp:inline distT="0" distB="0" distL="0" distR="0" wp14:anchorId="22B46714" wp14:editId="7DE33AA9">
+          <wp:inline distT="0" distB="0" distL="0" distR="0" wp14:anchorId="0398E409" wp14:editId="1B70D090">
             <wp:extent cx="5905500" cy="2505075"/>
             <wp:effectExtent l="0" t="0" r="0" b="0"/>
             <wp:docPr id="12" name="f08-hoja-de-ruta.png" descr="Estado de las tareas en GitHub al 29 de octubre de 2026." title="Figura 12"/>
@@ -43368,7 +43368,7 @@
         <w:pStyle w:val="Ttulo1"/>
         <w:pageBreakBefore/>
       </w:pPr>
-      <w:bookmarkStart w:id="33" w:name="_Toc244187015"/>
+      <w:bookmarkStart w:id="33" w:name="_Toc244187258"/>
       <w:r>
         <w:t>5. Retroalimentación que buscamos</w:t>
       </w:r>
@@ -44405,7 +44405,7 @@
         <w:pStyle w:val="Ttulo1"/>
         <w:pageBreakBefore/>
       </w:pPr>
-      <w:bookmarkStart w:id="34" w:name="_Toc244187016"/>
+      <w:bookmarkStart w:id="34" w:name="_Toc244187259"/>
       <w:r>
         <w:t>Referencias</w:t>
       </w:r>
@@ -49065,7 +49065,7 @@
         <w:pStyle w:val="Ttulo1"/>
         <w:spacing w:before="240" w:after="160"/>
       </w:pPr>
-      <w:bookmarkStart w:id="35" w:name="_Toc244187017"/>
+      <w:bookmarkStart w:id="35" w:name="_Toc244187260"/>
       <w:r>
         <w:t>Uso de inteligencia artificial</w:t>
       </w:r>
@@ -49095,7 +49095,7 @@
         <w:pStyle w:val="Ttulo1"/>
         <w:pageBreakBefore/>
       </w:pPr>
-      <w:bookmarkStart w:id="36" w:name="_Toc244187018"/>
+      <w:bookmarkStart w:id="36" w:name="_Toc244187261"/>
       <w:r>
         <w:t>Anexo A. El repositorio</w:t>
       </w:r>
@@ -49131,7 +49131,7 @@
           <w:noProof/>
         </w:rPr>
         <w:drawing>
-          <wp:inline distT="0" distB="0" distL="0" distR="0" wp14:anchorId="114E61C7" wp14:editId="0709D6DA">
+          <wp:inline distT="0" distB="0" distL="0" distR="0" wp14:anchorId="51FDECFE" wp14:editId="1579AD75">
             <wp:extent cx="5715000" cy="2247900"/>
             <wp:effectExtent l="0" t="0" r="0" b="0"/>
             <wp:docPr id="13" name="f04-flujo-codigo.png" descr="Recorrido de una corrida. Un solo comando lee la configuración, simula, estima, reconstruye, evalúa y escribe los resultados." title="Figura 13"/>
@@ -50669,9 +50669,9 @@
     <w:p>
       <w:pPr>
         <w:pStyle w:val="Ttulo1"/>
-        <w:spacing w:before="240" w:after="160"/>
-      </w:pPr>
-      <w:bookmarkStart w:id="37" w:name="_Toc244187019"/>
+        <w:pageBreakBefore/>
+      </w:pPr>
+      <w:bookmarkStart w:id="37" w:name="_Toc244187262"/>
       <w:r>
         <w:t>Anexo B. Cómo sumarte</w:t>
       </w:r>
@@ -50888,7 +50888,7 @@
         <w:pStyle w:val="Ttulo1"/>
         <w:pageBreakBefore/>
       </w:pPr>
-      <w:bookmarkStart w:id="38" w:name="_Toc244187020"/>
+      <w:bookmarkStart w:id="38" w:name="_Toc244187263"/>
       <w:r>
         <w:t>Anexo C. Glosario</w:t>
       </w:r>
@@ -52291,7 +52291,7 @@
         <w:pStyle w:val="Ttulo1"/>
         <w:pageBreakBefore/>
       </w:pPr>
-      <w:bookmarkStart w:id="39" w:name="_Toc244187021"/>
+      <w:bookmarkStart w:id="39" w:name="_Toc244187264"/>
       <w:r>
         <w:t>Anexo D. Cálculos paso a paso</w:t>
       </w:r>
@@ -53149,10 +53149,96 @@
 <file path=word/numbering.xml><?xml version="1.0" encoding="utf-8"?>
 <w:numbering xmlns:wpc="http://schemas.microsoft.com/office/word/2010/wordprocessingCanvas" xmlns:cx="http://schemas.microsoft.com/office/drawing/2014/chartex" xmlns:cx1="http://schemas.microsoft.com/office/drawing/2015/9/8/chartex" xmlns:cx2="http://schemas.microsoft.com/office/drawing/2015/10/21/chartex" xmlns:cx3="http://schemas.microsoft.com/office/drawing/2016/5/9/chartex" xmlns:cx4="http://schemas.microsoft.com/office/drawing/2016/5/10/chartex" xmlns:cx5="http://schemas.microsoft.com/office/drawing/2016/5/11/chartex" xmlns:cx6="http://schemas.microsoft.com/office/drawing/2016/5/12/chartex" xmlns:cx7="http://schemas.microsoft.com/office/drawing/2016/5/13/chartex" xmlns:cx8="http://schemas.microsoft.com/office/drawing/2016/5/14/chartex" xmlns:mc="http://schemas.openxmlformats.org/markup-compatibility/2006" xmlns:aink="http://schemas.microsoft.com/office/drawing/2016/ink" xmlns:am3d="http://schemas.microsoft.com/office/drawing/2017/model3d" xmlns:o="urn:schemas-microsoft-com:office:office" xmlns:oel="http://schemas.microsoft.com/office/2019/extlst" xmlns:r="http://schemas.openxmlformats.org/officeDocument/2006/relationships" xmlns:m="http://schemas.openxmlformats.org/officeDocument/2006/math" xmlns:v="urn:schemas-microsoft-com:vml" xmlns:wp14="http://schemas.microsoft.com/office/word/2010/wordprocessingDrawing" xmlns:wp="http://schemas.openxmlformats.org/drawingml/2006/wordprocessingDrawing" xmlns:w10="urn:schemas-microsoft-com:office:word" xmlns:w="http://schemas.openxmlformats.org/wordprocessingml/2006/main" xmlns:w14="http://schemas.microsoft.com/office/word/2010/wordml" xmlns:w15="http://schemas.microsoft.com/office/word/2012/wordml" xmlns:w16cex="http://schemas.microsoft.com/office/word/2018/wordml/cex" xmlns:w16cid="http://schemas.microsoft.com/office/word/2016/wordml/cid" xmlns:w16="http://schemas.microsoft.com/office/word/2018/wordml" xmlns:w16du="http://schemas.microsoft.com/office/word/2023/wordml/word16du" xmlns:w16sdtdh="http://schemas.microsoft.com/office/word/2020/wordml/sdtdatahash" xmlns:w16sdtfl="http://schemas.microsoft.com/office/word/2024/wordml/sdtformatlock" xmlns:w16se="http://schemas.microsoft.com/office/word/2015/wordml/symex" xmlns:wpg="http://schemas.microsoft.com/office/word/2010/wordprocessingGroup" xmlns:wpi="http://schemas.microsoft.com/office/word/2010/wordprocessingInk" xmlns:wne="http://schemas.microsoft.com/office/word/2006/wordml" xmlns:wps="http://schemas.microsoft.com/office/word/2010/wordprocessingShape" mc:Ignorable="w14 w15 w16se w16cid w16 w16cex w16sdtdh w16sdtfl w16du wp14">
   <w:abstractNum w:abstractNumId="0" w15:restartNumberingAfterBreak="0">
-    <w:nsid w:val="14A07156"/>
+    <w:nsid w:val="04C647A9"/>
     <w:multiLevelType w:val="hybridMultilevel"/>
-    <w:tmpl w:val="903EFE46"/>
-    <w:lvl w:ilvl="0" w:tplc="4734E8C0">
+    <w:tmpl w:val="4154B5D6"/>
+    <w:lvl w:ilvl="0" w:tplc="5832D3F6" w:tentative="1">
+      <w:start w:val="1"/>
+      <w:numFmt w:val="bullet"/>
+      <w:lvlText w:val="●"/>
+      <w:lvlJc w:val="left"/>
+      <w:pPr>
+        <w:ind w:left="720" w:hanging="360"/>
+      </w:pPr>
+    </w:lvl>
+    <w:lvl w:ilvl="1" w:tplc="00505A3E" w:tentative="1">
+      <w:start w:val="1"/>
+      <w:numFmt w:val="bullet"/>
+      <w:lvlText w:val="○"/>
+      <w:lvlJc w:val="left"/>
+      <w:pPr>
+        <w:ind w:left="1440" w:hanging="360"/>
+      </w:pPr>
+    </w:lvl>
+    <w:lvl w:ilvl="2" w:tplc="8F7E5EE4" w:tentative="1">
+      <w:start w:val="1"/>
+      <w:numFmt w:val="bullet"/>
+      <w:lvlText w:val="■"/>
+      <w:lvlJc w:val="left"/>
+      <w:pPr>
+        <w:ind w:left="2160" w:hanging="360"/>
+      </w:pPr>
+    </w:lvl>
+    <w:lvl w:ilvl="3" w:tplc="AD1C9984" w:tentative="1">
+      <w:start w:val="1"/>
+      <w:numFmt w:val="bullet"/>
+      <w:lvlText w:val="●"/>
+      <w:lvlJc w:val="left"/>
+      <w:pPr>
+        <w:ind w:left="2880" w:hanging="360"/>
+      </w:pPr>
+    </w:lvl>
+    <w:lvl w:ilvl="4" w:tplc="E4A6436A" w:tentative="1">
+      <w:start w:val="1"/>
+      <w:numFmt w:val="bullet"/>
+      <w:lvlText w:val="○"/>
+      <w:lvlJc w:val="left"/>
+      <w:pPr>
+        <w:ind w:left="3600" w:hanging="360"/>
+      </w:pPr>
+    </w:lvl>
+    <w:lvl w:ilvl="5" w:tplc="91666C78" w:tentative="1">
+      <w:start w:val="1"/>
+      <w:numFmt w:val="bullet"/>
+      <w:lvlText w:val="■"/>
+      <w:lvlJc w:val="left"/>
+      <w:pPr>
+        <w:ind w:left="4320" w:hanging="360"/>
+      </w:pPr>
+    </w:lvl>
+    <w:lvl w:ilvl="6" w:tplc="B95C78F8" w:tentative="1">
+      <w:start w:val="1"/>
+      <w:numFmt w:val="bullet"/>
+      <w:lvlText w:val="●"/>
+      <w:lvlJc w:val="left"/>
+      <w:pPr>
+        <w:ind w:left="5040" w:hanging="360"/>
+      </w:pPr>
+    </w:lvl>
+    <w:lvl w:ilvl="7" w:tplc="5C92D286" w:tentative="1">
+      <w:start w:val="1"/>
+      <w:numFmt w:val="bullet"/>
+      <w:lvlText w:val="●"/>
+      <w:lvlJc w:val="left"/>
+      <w:pPr>
+        <w:ind w:left="5760" w:hanging="360"/>
+      </w:pPr>
+    </w:lvl>
+    <w:lvl w:ilvl="8" w:tplc="0708FA16" w:tentative="1">
+      <w:start w:val="1"/>
+      <w:numFmt w:val="bullet"/>
+      <w:lvlText w:val="●"/>
+      <w:lvlJc w:val="left"/>
+      <w:pPr>
+        <w:ind w:left="6480" w:hanging="360"/>
+      </w:pPr>
+    </w:lvl>
+  </w:abstractNum>
+  <w:abstractNum w:abstractNumId="1" w15:restartNumberingAfterBreak="0">
+    <w:nsid w:val="04D63A38"/>
+    <w:multiLevelType w:val="hybridMultilevel"/>
+    <w:tmpl w:val="8EEA110C"/>
+    <w:lvl w:ilvl="0" w:tplc="460A4556">
       <w:start w:val="1"/>
       <w:numFmt w:val="bullet"/>
       <w:lvlText w:val="•"/>
@@ -53161,106 +53247,52 @@
         <w:ind w:left="600" w:hanging="300"/>
       </w:pPr>
     </w:lvl>
-    <w:lvl w:ilvl="1" w:tplc="A370882A">
+    <w:lvl w:ilvl="1" w:tplc="7F26408C">
       <w:numFmt w:val="decimal"/>
       <w:lvlText w:val=""/>
       <w:lvlJc w:val="left"/>
     </w:lvl>
-    <w:lvl w:ilvl="2" w:tplc="293C54D6">
+    <w:lvl w:ilvl="2" w:tplc="B2526042">
       <w:numFmt w:val="decimal"/>
       <w:lvlText w:val=""/>
       <w:lvlJc w:val="left"/>
     </w:lvl>
-    <w:lvl w:ilvl="3" w:tplc="FDD6C2C2">
+    <w:lvl w:ilvl="3" w:tplc="2730B0F6">
       <w:numFmt w:val="decimal"/>
       <w:lvlText w:val=""/>
       <w:lvlJc w:val="left"/>
     </w:lvl>
-    <w:lvl w:ilvl="4" w:tplc="3A5C3832">
+    <w:lvl w:ilvl="4" w:tplc="828A8FA8">
       <w:numFmt w:val="decimal"/>
       <w:lvlText w:val=""/>
       <w:lvlJc w:val="left"/>
     </w:lvl>
-    <w:lvl w:ilvl="5" w:tplc="21F4EFB4">
+    <w:lvl w:ilvl="5" w:tplc="AC3E56D2">
       <w:numFmt w:val="decimal"/>
       <w:lvlText w:val=""/>
       <w:lvlJc w:val="left"/>
     </w:lvl>
-    <w:lvl w:ilvl="6" w:tplc="76669338">
+    <w:lvl w:ilvl="6" w:tplc="28E09376">
       <w:numFmt w:val="decimal"/>
       <w:lvlText w:val=""/>
       <w:lvlJc w:val="left"/>
     </w:lvl>
-    <w:lvl w:ilvl="7" w:tplc="76DAEC1A">
+    <w:lvl w:ilvl="7" w:tplc="AFE8C72E">
       <w:numFmt w:val="decimal"/>
       <w:lvlText w:val=""/>
       <w:lvlJc w:val="left"/>
     </w:lvl>
-    <w:lvl w:ilvl="8" w:tplc="487E7890">
-      <w:numFmt w:val="decimal"/>
-      <w:lvlText w:val=""/>
-      <w:lvlJc w:val="left"/>
-    </w:lvl>
-  </w:abstractNum>
-  <w:abstractNum w:abstractNumId="1" w15:restartNumberingAfterBreak="0">
-    <w:nsid w:val="231108ED"/>
-    <w:multiLevelType w:val="hybridMultilevel"/>
-    <w:tmpl w:val="3C8ACA86"/>
-    <w:lvl w:ilvl="0" w:tplc="27ECD182">
-      <w:start w:val="1"/>
-      <w:numFmt w:val="decimal"/>
-      <w:lvlText w:val="%1."/>
-      <w:lvlJc w:val="left"/>
-      <w:pPr>
-        <w:ind w:left="600" w:hanging="360"/>
-      </w:pPr>
-    </w:lvl>
-    <w:lvl w:ilvl="1" w:tplc="159698A6">
-      <w:numFmt w:val="decimal"/>
-      <w:lvlText w:val=""/>
-      <w:lvlJc w:val="left"/>
-    </w:lvl>
-    <w:lvl w:ilvl="2" w:tplc="96F82564">
-      <w:numFmt w:val="decimal"/>
-      <w:lvlText w:val=""/>
-      <w:lvlJc w:val="left"/>
-    </w:lvl>
-    <w:lvl w:ilvl="3" w:tplc="ED96425E">
-      <w:numFmt w:val="decimal"/>
-      <w:lvlText w:val=""/>
-      <w:lvlJc w:val="left"/>
-    </w:lvl>
-    <w:lvl w:ilvl="4" w:tplc="6C7C5144">
-      <w:numFmt w:val="decimal"/>
-      <w:lvlText w:val=""/>
-      <w:lvlJc w:val="left"/>
-    </w:lvl>
-    <w:lvl w:ilvl="5" w:tplc="F45C15AA">
-      <w:numFmt w:val="decimal"/>
-      <w:lvlText w:val=""/>
-      <w:lvlJc w:val="left"/>
-    </w:lvl>
-    <w:lvl w:ilvl="6" w:tplc="A3265FBC">
-      <w:numFmt w:val="decimal"/>
-      <w:lvlText w:val=""/>
-      <w:lvlJc w:val="left"/>
-    </w:lvl>
-    <w:lvl w:ilvl="7" w:tplc="44F84FF0">
-      <w:numFmt w:val="decimal"/>
-      <w:lvlText w:val=""/>
-      <w:lvlJc w:val="left"/>
-    </w:lvl>
-    <w:lvl w:ilvl="8" w:tplc="26BA1AB0">
+    <w:lvl w:ilvl="8" w:tplc="B2F4A786">
       <w:numFmt w:val="decimal"/>
       <w:lvlText w:val=""/>
       <w:lvlJc w:val="left"/>
     </w:lvl>
   </w:abstractNum>
   <w:abstractNum w:abstractNumId="2" w15:restartNumberingAfterBreak="0">
-    <w:nsid w:val="2EEE1E05"/>
+    <w:nsid w:val="58730924"/>
     <w:multiLevelType w:val="hybridMultilevel"/>
-    <w:tmpl w:val="AF6E9CB0"/>
-    <w:lvl w:ilvl="0" w:tplc="889E991C">
+    <w:tmpl w:val="922C13AC"/>
+    <w:lvl w:ilvl="0" w:tplc="07325D9A" w:tentative="1">
       <w:start w:val="1"/>
       <w:numFmt w:val="decimal"/>
       <w:lvlText w:val="%1."/>
@@ -53269,138 +53301,52 @@
         <w:ind w:left="600" w:hanging="360"/>
       </w:pPr>
     </w:lvl>
-    <w:lvl w:ilvl="1" w:tplc="2B526EA2">
+    <w:lvl w:ilvl="1" w:tplc="708ADEA2">
       <w:numFmt w:val="decimal"/>
       <w:lvlText w:val=""/>
       <w:lvlJc w:val="left"/>
     </w:lvl>
-    <w:lvl w:ilvl="2" w:tplc="BA1C4922">
+    <w:lvl w:ilvl="2" w:tplc="75AA9854">
       <w:numFmt w:val="decimal"/>
       <w:lvlText w:val=""/>
       <w:lvlJc w:val="left"/>
     </w:lvl>
-    <w:lvl w:ilvl="3" w:tplc="EE2E1C0A">
+    <w:lvl w:ilvl="3" w:tplc="55004E88">
       <w:numFmt w:val="decimal"/>
       <w:lvlText w:val=""/>
       <w:lvlJc w:val="left"/>
     </w:lvl>
-    <w:lvl w:ilvl="4" w:tplc="063EDB10">
+    <w:lvl w:ilvl="4" w:tplc="4B7E6ECC">
       <w:numFmt w:val="decimal"/>
       <w:lvlText w:val=""/>
       <w:lvlJc w:val="left"/>
     </w:lvl>
-    <w:lvl w:ilvl="5" w:tplc="8DA68D30">
+    <w:lvl w:ilvl="5" w:tplc="F5E63D88">
       <w:numFmt w:val="decimal"/>
       <w:lvlText w:val=""/>
       <w:lvlJc w:val="left"/>
     </w:lvl>
-    <w:lvl w:ilvl="6" w:tplc="FB5EF9B8">
+    <w:lvl w:ilvl="6" w:tplc="F0C44D7C">
       <w:numFmt w:val="decimal"/>
       <w:lvlText w:val=""/>
       <w:lvlJc w:val="left"/>
     </w:lvl>
-    <w:lvl w:ilvl="7" w:tplc="9BA21FD4">
+    <w:lvl w:ilvl="7" w:tplc="038A33CE">
       <w:numFmt w:val="decimal"/>
       <w:lvlText w:val=""/>
       <w:lvlJc w:val="left"/>
     </w:lvl>
-    <w:lvl w:ilvl="8" w:tplc="91C4B12E">
+    <w:lvl w:ilvl="8" w:tplc="F168E956">
       <w:numFmt w:val="decimal"/>
       <w:lvlText w:val=""/>
       <w:lvlJc w:val="left"/>
     </w:lvl>
   </w:abstractNum>
   <w:abstractNum w:abstractNumId="3" w15:restartNumberingAfterBreak="0">
-    <w:nsid w:val="68350B87"/>
+    <w:nsid w:val="5CF91054"/>
     <w:multiLevelType w:val="hybridMultilevel"/>
-    <w:tmpl w:val="39D4EA94"/>
-    <w:lvl w:ilvl="0" w:tplc="E7AA0020" w:tentative="1">
-      <w:start w:val="1"/>
-      <w:numFmt w:val="bullet"/>
-      <w:lvlText w:val="●"/>
-      <w:lvlJc w:val="left"/>
-      <w:pPr>
-        <w:ind w:left="720" w:hanging="360"/>
-      </w:pPr>
-    </w:lvl>
-    <w:lvl w:ilvl="1" w:tplc="29E6AE20" w:tentative="1">
-      <w:start w:val="1"/>
-      <w:numFmt w:val="bullet"/>
-      <w:lvlText w:val="○"/>
-      <w:lvlJc w:val="left"/>
-      <w:pPr>
-        <w:ind w:left="1440" w:hanging="360"/>
-      </w:pPr>
-    </w:lvl>
-    <w:lvl w:ilvl="2" w:tplc="A532DD32" w:tentative="1">
-      <w:start w:val="1"/>
-      <w:numFmt w:val="bullet"/>
-      <w:lvlText w:val="■"/>
-      <w:lvlJc w:val="left"/>
-      <w:pPr>
-        <w:ind w:left="2160" w:hanging="360"/>
-      </w:pPr>
-    </w:lvl>
-    <w:lvl w:ilvl="3" w:tplc="44608F28" w:tentative="1">
-      <w:start w:val="1"/>
-      <w:numFmt w:val="bullet"/>
-      <w:lvlText w:val="●"/>
-      <w:lvlJc w:val="left"/>
-      <w:pPr>
-        <w:ind w:left="2880" w:hanging="360"/>
-      </w:pPr>
-    </w:lvl>
-    <w:lvl w:ilvl="4" w:tplc="738E914A" w:tentative="1">
-      <w:start w:val="1"/>
-      <w:numFmt w:val="bullet"/>
-      <w:lvlText w:val="○"/>
-      <w:lvlJc w:val="left"/>
-      <w:pPr>
-        <w:ind w:left="3600" w:hanging="360"/>
-      </w:pPr>
-    </w:lvl>
-    <w:lvl w:ilvl="5" w:tplc="5D1C6AB8" w:tentative="1">
-      <w:start w:val="1"/>
-      <w:numFmt w:val="bullet"/>
-      <w:lvlText w:val="■"/>
-      <w:lvlJc w:val="left"/>
-      <w:pPr>
-        <w:ind w:left="4320" w:hanging="360"/>
-      </w:pPr>
-    </w:lvl>
-    <w:lvl w:ilvl="6" w:tplc="AC244B90" w:tentative="1">
-      <w:start w:val="1"/>
-      <w:numFmt w:val="bullet"/>
-      <w:lvlText w:val="●"/>
-      <w:lvlJc w:val="left"/>
-      <w:pPr>
-        <w:ind w:left="5040" w:hanging="360"/>
-      </w:pPr>
-    </w:lvl>
-    <w:lvl w:ilvl="7" w:tplc="2C12FA78" w:tentative="1">
-      <w:start w:val="1"/>
-      <w:numFmt w:val="bullet"/>
-      <w:lvlText w:val="●"/>
-      <w:lvlJc w:val="left"/>
-      <w:pPr>
-        <w:ind w:left="5760" w:hanging="360"/>
-      </w:pPr>
-    </w:lvl>
-    <w:lvl w:ilvl="8" w:tplc="755A63C0" w:tentative="1">
-      <w:start w:val="1"/>
-      <w:numFmt w:val="bullet"/>
-      <w:lvlText w:val="●"/>
-      <w:lvlJc w:val="left"/>
-      <w:pPr>
-        <w:ind w:left="6480" w:hanging="360"/>
-      </w:pPr>
-    </w:lvl>
-  </w:abstractNum>
-  <w:abstractNum w:abstractNumId="4" w15:restartNumberingAfterBreak="0">
-    <w:nsid w:val="6ECE27DE"/>
-    <w:multiLevelType w:val="hybridMultilevel"/>
-    <w:tmpl w:val="5EF0B0E0"/>
-    <w:lvl w:ilvl="0" w:tplc="EE3874D2" w:tentative="1">
+    <w:tmpl w:val="24DC6A64"/>
+    <w:lvl w:ilvl="0" w:tplc="11184D2C">
       <w:start w:val="1"/>
       <w:numFmt w:val="decimal"/>
       <w:lvlText w:val="%1."/>
@@ -53409,52 +53355,106 @@
         <w:ind w:left="600" w:hanging="360"/>
       </w:pPr>
     </w:lvl>
-    <w:lvl w:ilvl="1" w:tplc="23607C54">
+    <w:lvl w:ilvl="1" w:tplc="1D92BD24">
       <w:numFmt w:val="decimal"/>
       <w:lvlText w:val=""/>
       <w:lvlJc w:val="left"/>
     </w:lvl>
-    <w:lvl w:ilvl="2" w:tplc="47AC0236">
+    <w:lvl w:ilvl="2" w:tplc="A93CCE34">
       <w:numFmt w:val="decimal"/>
       <w:lvlText w:val=""/>
       <w:lvlJc w:val="left"/>
     </w:lvl>
-    <w:lvl w:ilvl="3" w:tplc="2FA8AD68">
+    <w:lvl w:ilvl="3" w:tplc="4D1453FC">
       <w:numFmt w:val="decimal"/>
       <w:lvlText w:val=""/>
       <w:lvlJc w:val="left"/>
     </w:lvl>
-    <w:lvl w:ilvl="4" w:tplc="F7D64F8C">
+    <w:lvl w:ilvl="4" w:tplc="6B3EADAA">
       <w:numFmt w:val="decimal"/>
       <w:lvlText w:val=""/>
       <w:lvlJc w:val="left"/>
     </w:lvl>
-    <w:lvl w:ilvl="5" w:tplc="FD6808C4">
+    <w:lvl w:ilvl="5" w:tplc="F67A5D48">
       <w:numFmt w:val="decimal"/>
       <w:lvlText w:val=""/>
       <w:lvlJc w:val="left"/>
     </w:lvl>
-    <w:lvl w:ilvl="6" w:tplc="8982BF5E">
+    <w:lvl w:ilvl="6" w:tplc="E7D8FAF2">
       <w:numFmt w:val="decimal"/>
       <w:lvlText w:val=""/>
       <w:lvlJc w:val="left"/>
     </w:lvl>
-    <w:lvl w:ilvl="7" w:tplc="1FA45022">
+    <w:lvl w:ilvl="7" w:tplc="B0F4F40A">
       <w:numFmt w:val="decimal"/>
       <w:lvlText w:val=""/>
       <w:lvlJc w:val="left"/>
     </w:lvl>
-    <w:lvl w:ilvl="8" w:tplc="B8BA4AC4">
+    <w:lvl w:ilvl="8" w:tplc="E98C336E">
+      <w:numFmt w:val="decimal"/>
+      <w:lvlText w:val=""/>
+      <w:lvlJc w:val="left"/>
+    </w:lvl>
+  </w:abstractNum>
+  <w:abstractNum w:abstractNumId="4" w15:restartNumberingAfterBreak="0">
+    <w:nsid w:val="6E395641"/>
+    <w:multiLevelType w:val="hybridMultilevel"/>
+    <w:tmpl w:val="722A1DF4"/>
+    <w:lvl w:ilvl="0" w:tplc="61625FB6">
+      <w:start w:val="1"/>
+      <w:numFmt w:val="decimal"/>
+      <w:lvlText w:val="%1."/>
+      <w:lvlJc w:val="left"/>
+      <w:pPr>
+        <w:ind w:left="600" w:hanging="360"/>
+      </w:pPr>
+    </w:lvl>
+    <w:lvl w:ilvl="1" w:tplc="5ABC6B36">
+      <w:numFmt w:val="decimal"/>
+      <w:lvlText w:val=""/>
+      <w:lvlJc w:val="left"/>
+    </w:lvl>
+    <w:lvl w:ilvl="2" w:tplc="94585BB0">
+      <w:numFmt w:val="decimal"/>
+      <w:lvlText w:val=""/>
+      <w:lvlJc w:val="left"/>
+    </w:lvl>
+    <w:lvl w:ilvl="3" w:tplc="D680755E">
+      <w:numFmt w:val="decimal"/>
+      <w:lvlText w:val=""/>
+      <w:lvlJc w:val="left"/>
+    </w:lvl>
+    <w:lvl w:ilvl="4" w:tplc="1804C9B0">
+      <w:numFmt w:val="decimal"/>
+      <w:lvlText w:val=""/>
+      <w:lvlJc w:val="left"/>
+    </w:lvl>
+    <w:lvl w:ilvl="5" w:tplc="029A1F7E">
+      <w:numFmt w:val="decimal"/>
+      <w:lvlText w:val=""/>
+      <w:lvlJc w:val="left"/>
+    </w:lvl>
+    <w:lvl w:ilvl="6" w:tplc="A3DEF8A6">
+      <w:numFmt w:val="decimal"/>
+      <w:lvlText w:val=""/>
+      <w:lvlJc w:val="left"/>
+    </w:lvl>
+    <w:lvl w:ilvl="7" w:tplc="A84600AC">
+      <w:numFmt w:val="decimal"/>
+      <w:lvlText w:val=""/>
+      <w:lvlJc w:val="left"/>
+    </w:lvl>
+    <w:lvl w:ilvl="8" w:tplc="06AE906A">
       <w:numFmt w:val="decimal"/>
       <w:lvlText w:val=""/>
       <w:lvlJc w:val="left"/>
     </w:lvl>
   </w:abstractNum>
   <w:abstractNum w:abstractNumId="5" w15:restartNumberingAfterBreak="0">
-    <w:nsid w:val="7925550A"/>
+    <w:nsid w:val="7B3A2709"/>
     <w:multiLevelType w:val="hybridMultilevel"/>
-    <w:tmpl w:val="6784C734"/>
-    <w:lvl w:ilvl="0" w:tplc="8BD4B9F6">
+    <w:tmpl w:val="6CDCD556"/>
+    <w:lvl w:ilvl="0" w:tplc="D7345F4A">
       <w:start w:val="1"/>
       <w:numFmt w:val="decimal"/>
       <w:lvlText w:val="%1."/>
@@ -53463,73 +53463,73 @@
         <w:ind w:left="600" w:hanging="360"/>
       </w:pPr>
     </w:lvl>
-    <w:lvl w:ilvl="1" w:tplc="874A90D2">
+    <w:lvl w:ilvl="1" w:tplc="03481FB6">
       <w:numFmt w:val="decimal"/>
       <w:lvlText w:val=""/>
       <w:lvlJc w:val="left"/>
     </w:lvl>
-    <w:lvl w:ilvl="2" w:tplc="533A6B42">
+    <w:lvl w:ilvl="2" w:tplc="0ECE4B34">
       <w:numFmt w:val="decimal"/>
       <w:lvlText w:val=""/>
       <w:lvlJc w:val="left"/>
     </w:lvl>
-    <w:lvl w:ilvl="3" w:tplc="540849A6">
+    <w:lvl w:ilvl="3" w:tplc="63DEA248">
       <w:numFmt w:val="decimal"/>
       <w:lvlText w:val=""/>
       <w:lvlJc w:val="left"/>
     </w:lvl>
-    <w:lvl w:ilvl="4" w:tplc="C11861C6">
+    <w:lvl w:ilvl="4" w:tplc="18A26F94">
       <w:numFmt w:val="decimal"/>
       <w:lvlText w:val=""/>
       <w:lvlJc w:val="left"/>
     </w:lvl>
-    <w:lvl w:ilvl="5" w:tplc="4600F36A">
+    <w:lvl w:ilvl="5" w:tplc="178827C8">
       <w:numFmt w:val="decimal"/>
       <w:lvlText w:val=""/>
       <w:lvlJc w:val="left"/>
     </w:lvl>
-    <w:lvl w:ilvl="6" w:tplc="B13AAEB4">
+    <w:lvl w:ilvl="6" w:tplc="A0AA35F0">
       <w:numFmt w:val="decimal"/>
       <w:lvlText w:val=""/>
       <w:lvlJc w:val="left"/>
     </w:lvl>
-    <w:lvl w:ilvl="7" w:tplc="E2D0CAEA">
+    <w:lvl w:ilvl="7" w:tplc="C90A21A6">
       <w:numFmt w:val="decimal"/>
       <w:lvlText w:val=""/>
       <w:lvlJc w:val="left"/>
     </w:lvl>
-    <w:lvl w:ilvl="8" w:tplc="1D443CCC">
+    <w:lvl w:ilvl="8" w:tplc="5762C774">
       <w:numFmt w:val="decimal"/>
       <w:lvlText w:val=""/>
       <w:lvlJc w:val="left"/>
     </w:lvl>
   </w:abstractNum>
-  <w:num w:numId="1" w16cid:durableId="571935443">
+  <w:num w:numId="1" w16cid:durableId="342558137">
+    <w:abstractNumId w:val="0"/>
+    <w:lvlOverride w:ilvl="0">
+      <w:startOverride w:val="1"/>
+    </w:lvlOverride>
+  </w:num>
+  <w:num w:numId="2" w16cid:durableId="1097676855">
+    <w:abstractNumId w:val="1"/>
+    <w:lvlOverride w:ilvl="0">
+      <w:startOverride w:val="1"/>
+    </w:lvlOverride>
+  </w:num>
+  <w:num w:numId="3" w16cid:durableId="1643387774">
+    <w:abstractNumId w:val="5"/>
+    <w:lvlOverride w:ilvl="0">
+      <w:startOverride w:val="1"/>
+    </w:lvlOverride>
+  </w:num>
+  <w:num w:numId="4" w16cid:durableId="1242645807">
     <w:abstractNumId w:val="3"/>
     <w:lvlOverride w:ilvl="0">
       <w:startOverride w:val="1"/>
     </w:lvlOverride>
   </w:num>
-  <w:num w:numId="2" w16cid:durableId="488599569">
-    <w:abstractNumId w:val="0"/>
-    <w:lvlOverride w:ilvl="0">
-      <w:startOverride w:val="1"/>
-    </w:lvlOverride>
-  </w:num>
-  <w:num w:numId="3" w16cid:durableId="520165284">
-    <w:abstractNumId w:val="5"/>
-    <w:lvlOverride w:ilvl="0">
-      <w:startOverride w:val="1"/>
-    </w:lvlOverride>
-  </w:num>
-  <w:num w:numId="4" w16cid:durableId="1788887232">
-    <w:abstractNumId w:val="2"/>
-    <w:lvlOverride w:ilvl="0">
-      <w:startOverride w:val="1"/>
-    </w:lvlOverride>
-  </w:num>
-  <w:num w:numId="5" w16cid:durableId="391513062">
-    <w:abstractNumId w:val="1"/>
+  <w:num w:numId="5" w16cid:durableId="1854763155">
+    <w:abstractNumId w:val="4"/>
     <w:lvlOverride w:ilvl="0">
       <w:startOverride w:val="1"/>
     </w:lvlOverride>

</xml_diff>